<commit_message>
chore(deploy): update UFW allowed subnets for RIDIS
Restrict and clarify the allowed subnets for port 3005 in the internal firewall documentation and scripts to align with specific DGLAB network segments.
</commit_message>
<xml_diff>
--- a/RIDIS_Especificacao_Tecnica_ISO27001_NIS2.docx
+++ b/RIDIS_Especificacao_Tecnica_ISO27001_NIS2.docx
@@ -4316,7 +4316,49 @@
                 <w:sz w:val="16"/>
                 <w:szCs w:val="16"/>
               </w:rPr>
-              <w:t xml:space="preserve">sudo ufw allow from 10.0.0.0/8 to any port 3005 proto tcp comment 'RIDIS HTTP Porta 3005'</w:t>
+              <w:t xml:space="preserve">sudo ufw allow from 10.0.0.0/22 to any port 3005</w:t>
+            </w:r>
+          </w:p>
+          <w:p>
+            <w:pPr>
+              <w:spacing w:after="20" w:before="20"/>
+            </w:pPr>
+            <w:r>
+              <w:rPr>
+                <w:rFonts w:ascii="Consolas" w:cs="Consolas" w:eastAsia="Consolas" w:hAnsi="Consolas"/>
+                <w:color w:val="0f172a"/>
+                <w:sz w:val="16"/>
+                <w:szCs w:val="16"/>
+              </w:rPr>
+              <w:t xml:space="preserve">sudo ufw allow from 10.0.4.0/24 to any port 3005</w:t>
+            </w:r>
+          </w:p>
+          <w:p>
+            <w:pPr>
+              <w:spacing w:after="20" w:before="20"/>
+            </w:pPr>
+            <w:r>
+              <w:rPr>
+                <w:rFonts w:ascii="Consolas" w:cs="Consolas" w:eastAsia="Consolas" w:hAnsi="Consolas"/>
+                <w:color w:val="0f172a"/>
+                <w:sz w:val="16"/>
+                <w:szCs w:val="16"/>
+              </w:rPr>
+              <w:t xml:space="preserve">sudo ufw allow from 172.29.0.0/24 to any port 3005</w:t>
+            </w:r>
+          </w:p>
+          <w:p>
+            <w:pPr>
+              <w:spacing w:after="20" w:before="20"/>
+            </w:pPr>
+            <w:r>
+              <w:rPr>
+                <w:rFonts w:ascii="Consolas" w:cs="Consolas" w:eastAsia="Consolas" w:hAnsi="Consolas"/>
+                <w:color w:val="0f172a"/>
+                <w:sz w:val="16"/>
+                <w:szCs w:val="16"/>
+              </w:rPr>
+              <w:t xml:space="preserve">sudo ufw allow from 192.168.111.0/24 to any port 3005</w:t>
             </w:r>
           </w:p>
           <w:p>

</xml_diff>